<commit_message>
Completo el manual de marca con las aplicaciones y los derechos de autor, actualización del README
</commit_message>
<xml_diff>
--- a/docs/diseno/INVENTRA_Manual_de_Marca.docx
+++ b/docs/diseno/INVENTRA_Manual_de_Marca.docx
@@ -1599,6 +1599,246 @@
       <w:r>
         <w:fldChar w:fldCharType="begin" w:dirty="true"/>
         <w:instrText xml:space="preserve">PAGEREF bm34</w:instrText>
+        <w:fldChar w:fldCharType="end"/>
+      </w:r>
+    </w:p>
+    <w:p>
+      <w:pPr>
+        <w:tabs>
+          <w:tab w:val="right" w:pos="9200" w:leader="dot"/>
+        </w:tabs>
+        <w:spacing w:after="40" w:line="252"/>
+      </w:pPr>
+      <w:hyperlink w:history="1" w:anchor="bm35">
+        <w:r>
+          <w:rPr>
+            <w:rFonts w:ascii="Arial" w:cs="Arial" w:eastAsia="Arial" w:hAnsi="Arial"/>
+            <w:b/>
+            <w:bCs/>
+            <w:color w:val="1F3864"/>
+            <w:sz w:val="21"/>
+            <w:szCs w:val="21"/>
+          </w:rPr>
+          <w:t xml:space="preserve">10. La marca en el producto</w:t>
+        </w:r>
+      </w:hyperlink>
+      <w:r>
+        <w:rPr>
+          <w:rFonts w:ascii="Arial" w:cs="Arial" w:eastAsia="Arial" w:hAnsi="Arial"/>
+          <w:sz w:val="20"/>
+          <w:szCs w:val="20"/>
+        </w:rPr>
+        <w:t xml:space="preserve">	</w:t>
+      </w:r>
+      <w:r>
+        <w:fldChar w:fldCharType="begin" w:dirty="true"/>
+        <w:instrText xml:space="preserve">PAGEREF bm35</w:instrText>
+        <w:fldChar w:fldCharType="end"/>
+      </w:r>
+    </w:p>
+    <w:p>
+      <w:pPr>
+        <w:tabs>
+          <w:tab w:val="right" w:pos="9200" w:leader="dot"/>
+        </w:tabs>
+        <w:spacing w:after="40" w:line="252"/>
+      </w:pPr>
+      <w:hyperlink w:history="1" w:anchor="bm36">
+        <w:r>
+          <w:rPr>
+            <w:rFonts w:ascii="Arial" w:cs="Arial" w:eastAsia="Arial" w:hAnsi="Arial"/>
+            <w:b/>
+            <w:bCs/>
+            <w:color w:val="1F3864"/>
+            <w:sz w:val="21"/>
+            <w:szCs w:val="21"/>
+          </w:rPr>
+          <w:t xml:space="preserve">11. Piezas de comunicación</w:t>
+        </w:r>
+      </w:hyperlink>
+      <w:r>
+        <w:rPr>
+          <w:rFonts w:ascii="Arial" w:cs="Arial" w:eastAsia="Arial" w:hAnsi="Arial"/>
+          <w:sz w:val="20"/>
+          <w:szCs w:val="20"/>
+        </w:rPr>
+        <w:t xml:space="preserve">	</w:t>
+      </w:r>
+      <w:r>
+        <w:fldChar w:fldCharType="begin" w:dirty="true"/>
+        <w:instrText xml:space="preserve">PAGEREF bm36</w:instrText>
+        <w:fldChar w:fldCharType="end"/>
+      </w:r>
+    </w:p>
+    <w:p>
+      <w:pPr>
+        <w:tabs>
+          <w:tab w:val="right" w:pos="9200" w:leader="dot"/>
+        </w:tabs>
+        <w:spacing w:after="40" w:line="252"/>
+        <w:ind w:left="360"/>
+      </w:pPr>
+      <w:hyperlink w:history="1" w:anchor="bm37">
+        <w:r>
+          <w:rPr>
+            <w:rFonts w:ascii="Arial" w:cs="Arial" w:eastAsia="Arial" w:hAnsi="Arial"/>
+            <w:b w:val="false"/>
+            <w:bCs w:val="false"/>
+            <w:color w:val="1F3864"/>
+            <w:sz w:val="20"/>
+            <w:szCs w:val="20"/>
+          </w:rPr>
+          <w:t xml:space="preserve">11.1 Aplicaciones básicas</w:t>
+        </w:r>
+      </w:hyperlink>
+      <w:r>
+        <w:rPr>
+          <w:rFonts w:ascii="Arial" w:cs="Arial" w:eastAsia="Arial" w:hAnsi="Arial"/>
+          <w:sz w:val="20"/>
+          <w:szCs w:val="20"/>
+        </w:rPr>
+        <w:t xml:space="preserve">	</w:t>
+      </w:r>
+      <w:r>
+        <w:fldChar w:fldCharType="begin" w:dirty="true"/>
+        <w:instrText xml:space="preserve">PAGEREF bm37</w:instrText>
+        <w:fldChar w:fldCharType="end"/>
+      </w:r>
+    </w:p>
+    <w:p>
+      <w:pPr>
+        <w:tabs>
+          <w:tab w:val="right" w:pos="9200" w:leader="dot"/>
+        </w:tabs>
+        <w:spacing w:after="40" w:line="252"/>
+        <w:ind w:left="360"/>
+      </w:pPr>
+      <w:hyperlink w:history="1" w:anchor="bm38">
+        <w:r>
+          <w:rPr>
+            <w:rFonts w:ascii="Arial" w:cs="Arial" w:eastAsia="Arial" w:hAnsi="Arial"/>
+            <w:b w:val="false"/>
+            <w:bCs w:val="false"/>
+            <w:color w:val="1F3864"/>
+            <w:sz w:val="20"/>
+            <w:szCs w:val="20"/>
+          </w:rPr>
+          <w:t xml:space="preserve">11.2 Cómo producir una pieza nueva</w:t>
+        </w:r>
+      </w:hyperlink>
+      <w:r>
+        <w:rPr>
+          <w:rFonts w:ascii="Arial" w:cs="Arial" w:eastAsia="Arial" w:hAnsi="Arial"/>
+          <w:sz w:val="20"/>
+          <w:szCs w:val="20"/>
+        </w:rPr>
+        <w:t xml:space="preserve">	</w:t>
+      </w:r>
+      <w:r>
+        <w:fldChar w:fldCharType="begin" w:dirty="true"/>
+        <w:instrText xml:space="preserve">PAGEREF bm38</w:instrText>
+        <w:fldChar w:fldCharType="end"/>
+      </w:r>
+    </w:p>
+    <w:p>
+      <w:pPr>
+        <w:tabs>
+          <w:tab w:val="right" w:pos="9200" w:leader="dot"/>
+        </w:tabs>
+        <w:spacing w:after="40" w:line="252"/>
+      </w:pPr>
+      <w:hyperlink w:history="1" w:anchor="bm39">
+        <w:r>
+          <w:rPr>
+            <w:rFonts w:ascii="Arial" w:cs="Arial" w:eastAsia="Arial" w:hAnsi="Arial"/>
+            <w:b/>
+            <w:bCs/>
+            <w:color w:val="1F3864"/>
+            <w:sz w:val="21"/>
+            <w:szCs w:val="21"/>
+          </w:rPr>
+          <w:t xml:space="preserve">12. Derechos de autor y créditos</w:t>
+        </w:r>
+      </w:hyperlink>
+      <w:r>
+        <w:rPr>
+          <w:rFonts w:ascii="Arial" w:cs="Arial" w:eastAsia="Arial" w:hAnsi="Arial"/>
+          <w:sz w:val="20"/>
+          <w:szCs w:val="20"/>
+        </w:rPr>
+        <w:t xml:space="preserve">	</w:t>
+      </w:r>
+      <w:r>
+        <w:fldChar w:fldCharType="begin" w:dirty="true"/>
+        <w:instrText xml:space="preserve">PAGEREF bm39</w:instrText>
+        <w:fldChar w:fldCharType="end"/>
+      </w:r>
+    </w:p>
+    <w:p>
+      <w:pPr>
+        <w:tabs>
+          <w:tab w:val="right" w:pos="9200" w:leader="dot"/>
+        </w:tabs>
+        <w:spacing w:after="40" w:line="252"/>
+      </w:pPr>
+      <w:hyperlink w:history="1" w:anchor="bm40">
+        <w:r>
+          <w:rPr>
+            <w:rFonts w:ascii="Arial" w:cs="Arial" w:eastAsia="Arial" w:hAnsi="Arial"/>
+            <w:b/>
+            <w:bCs/>
+            <w:color w:val="1F3864"/>
+            <w:sz w:val="21"/>
+            <w:szCs w:val="21"/>
+          </w:rPr>
+          <w:t xml:space="preserve">13. Conclusión</w:t>
+        </w:r>
+      </w:hyperlink>
+      <w:r>
+        <w:rPr>
+          <w:rFonts w:ascii="Arial" w:cs="Arial" w:eastAsia="Arial" w:hAnsi="Arial"/>
+          <w:sz w:val="20"/>
+          <w:szCs w:val="20"/>
+        </w:rPr>
+        <w:t xml:space="preserve">	</w:t>
+      </w:r>
+      <w:r>
+        <w:fldChar w:fldCharType="begin" w:dirty="true"/>
+        <w:instrText xml:space="preserve">PAGEREF bm40</w:instrText>
+        <w:fldChar w:fldCharType="end"/>
+      </w:r>
+    </w:p>
+    <w:p>
+      <w:pPr>
+        <w:tabs>
+          <w:tab w:val="right" w:pos="9200" w:leader="dot"/>
+        </w:tabs>
+        <w:spacing w:after="40" w:line="252"/>
+      </w:pPr>
+      <w:hyperlink w:history="1" w:anchor="bm41">
+        <w:r>
+          <w:rPr>
+            <w:rFonts w:ascii="Arial" w:cs="Arial" w:eastAsia="Arial" w:hAnsi="Arial"/>
+            <w:b/>
+            <w:bCs/>
+            <w:color w:val="1F3864"/>
+            <w:sz w:val="21"/>
+            <w:szCs w:val="21"/>
+          </w:rPr>
+          <w:t xml:space="preserve">14. Referencias</w:t>
+        </w:r>
+      </w:hyperlink>
+      <w:r>
+        <w:rPr>
+          <w:rFonts w:ascii="Arial" w:cs="Arial" w:eastAsia="Arial" w:hAnsi="Arial"/>
+          <w:sz w:val="20"/>
+          <w:szCs w:val="20"/>
+        </w:rPr>
+        <w:t xml:space="preserve">	</w:t>
+      </w:r>
+      <w:r>
+        <w:fldChar w:fldCharType="begin" w:dirty="true"/>
+        <w:instrText xml:space="preserve">PAGEREF bm41</w:instrText>
         <w:fldChar w:fldCharType="end"/>
       </w:r>
     </w:p>
@@ -8560,6 +8800,1665 @@
           <w:szCs w:val="22"/>
         </w:rPr>
         <w:t xml:space="preserve">No forman parte de la identidad las fotografías de producto, las ilustraciones de personajes ni las imágenes de bebidas alcohólicas, por las razones expuestas en el apartado 3.2.</w:t>
+      </w:r>
+    </w:p>
+    <w:p>
+      <w:pPr>
+        <w:pStyle w:val="Heading1"/>
+        <w:pageBreakBefore/>
+        <w:spacing w:after="110" w:before="220"/>
+      </w:pPr>
+      <w:bookmarkStart w:name="bm35" w:id="35"/>
+      <w:r>
+        <w:rPr>
+          <w:rFonts w:ascii="Arial" w:cs="Arial" w:eastAsia="Arial" w:hAnsi="Arial"/>
+          <w:b/>
+          <w:bCs/>
+          <w:color w:val="1F3864"/>
+          <w:sz w:val="27"/>
+          <w:szCs w:val="27"/>
+        </w:rPr>
+        <w:t xml:space="preserve">10. La marca en el producto</w:t>
+      </w:r>
+      <w:bookmarkEnd w:id="35"/>
+    </w:p>
+    <w:p>
+      <w:pPr>
+        <w:spacing w:after="110" w:line="262"/>
+        <w:jc w:val="both"/>
+      </w:pPr>
+      <w:r>
+        <w:rPr>
+          <w:rFonts w:ascii="Arial" w:cs="Arial" w:eastAsia="Arial" w:hAnsi="Arial"/>
+          <w:sz w:val="22"/>
+          <w:szCs w:val="22"/>
+        </w:rPr>
+        <w:t xml:space="preserve">La aplicación es el lugar donde el cliente convive a diario con la marca; por eso su presencia allí debe ser constante pero discreta. El logotipo aparece en los puntos donde el usuario necesita reconocer dónde está, y no compite con la información del negocio.</w:t>
+      </w:r>
+    </w:p>
+    <w:tbl>
+      <w:tblPr>
+        <w:tblW w:type="dxa" w:w="9360"/>
+        <w:tblBorders>
+          <w:top w:val="single" w:color="9CA3AF" w:sz="6"/>
+          <w:left w:val="single" w:color="9CA3AF" w:sz="6"/>
+          <w:bottom w:val="single" w:color="9CA3AF" w:sz="6"/>
+          <w:right w:val="single" w:color="9CA3AF" w:sz="6"/>
+          <w:insideH w:val="single" w:color="9CA3AF" w:sz="6"/>
+          <w:insideV w:val="single" w:color="9CA3AF" w:sz="6"/>
+        </w:tblBorders>
+        <w:tblLayout w:type="fixed"/>
+      </w:tblPr>
+      <w:tblGrid>
+        <w:gridCol w:w="2500"/>
+        <w:gridCol w:w="2300"/>
+        <w:gridCol w:w="4560"/>
+      </w:tblGrid>
+      <w:tr>
+        <w:trPr>
+          <w:tblHeader/>
+        </w:trPr>
+        <w:tc>
+          <w:tcPr>
+            <w:tcW w:type="dxa" w:w="2500"/>
+            <w:shd w:fill="1F3864" w:val="clear"/>
+            <w:tcMar>
+              <w:top w:type="dxa" w:w="40"/>
+              <w:left w:type="dxa" w:w="70"/>
+              <w:bottom w:type="dxa" w:w="40"/>
+              <w:right w:type="dxa" w:w="70"/>
+            </w:tcMar>
+          </w:tcPr>
+          <w:p>
+            <w:pPr>
+              <w:spacing w:after="0" w:line="236"/>
+            </w:pPr>
+            <w:r>
+              <w:rPr>
+                <w:rFonts w:ascii="Arial" w:cs="Arial" w:eastAsia="Arial" w:hAnsi="Arial"/>
+                <w:b/>
+                <w:bCs/>
+                <w:color w:val="FFFFFF"/>
+                <w:sz w:val="19"/>
+                <w:szCs w:val="19"/>
+              </w:rPr>
+              <w:t xml:space="preserve">Lugar</w:t>
+            </w:r>
+          </w:p>
+        </w:tc>
+        <w:tc>
+          <w:tcPr>
+            <w:tcW w:type="dxa" w:w="2300"/>
+            <w:shd w:fill="1F3864" w:val="clear"/>
+            <w:tcMar>
+              <w:top w:type="dxa" w:w="40"/>
+              <w:left w:type="dxa" w:w="70"/>
+              <w:bottom w:type="dxa" w:w="40"/>
+              <w:right w:type="dxa" w:w="70"/>
+            </w:tcMar>
+          </w:tcPr>
+          <w:p>
+            <w:pPr>
+              <w:spacing w:after="0" w:line="236"/>
+            </w:pPr>
+            <w:r>
+              <w:rPr>
+                <w:rFonts w:ascii="Arial" w:cs="Arial" w:eastAsia="Arial" w:hAnsi="Arial"/>
+                <w:b/>
+                <w:bCs/>
+                <w:color w:val="FFFFFF"/>
+                <w:sz w:val="19"/>
+                <w:szCs w:val="19"/>
+              </w:rPr>
+              <w:t xml:space="preserve">Versión</w:t>
+            </w:r>
+          </w:p>
+        </w:tc>
+        <w:tc>
+          <w:tcPr>
+            <w:tcW w:type="dxa" w:w="4560"/>
+            <w:shd w:fill="1F3864" w:val="clear"/>
+            <w:tcMar>
+              <w:top w:type="dxa" w:w="40"/>
+              <w:left w:type="dxa" w:w="70"/>
+              <w:bottom w:type="dxa" w:w="40"/>
+              <w:right w:type="dxa" w:w="70"/>
+            </w:tcMar>
+          </w:tcPr>
+          <w:p>
+            <w:pPr>
+              <w:spacing w:after="0" w:line="236"/>
+            </w:pPr>
+            <w:r>
+              <w:rPr>
+                <w:rFonts w:ascii="Arial" w:cs="Arial" w:eastAsia="Arial" w:hAnsi="Arial"/>
+                <w:b/>
+                <w:bCs/>
+                <w:color w:val="FFFFFF"/>
+                <w:sz w:val="19"/>
+                <w:szCs w:val="19"/>
+              </w:rPr>
+              <w:t xml:space="preserve">Criterio</w:t>
+            </w:r>
+          </w:p>
+        </w:tc>
+      </w:tr>
+      <w:tr>
+        <w:trPr>
+          <w:tblHeader w:val="false"/>
+        </w:trPr>
+        <w:tc>
+          <w:tcPr>
+            <w:tcW w:type="dxa" w:w="2500"/>
+            <w:shd w:fill="FFFFFF" w:val="clear"/>
+            <w:tcMar>
+              <w:top w:type="dxa" w:w="40"/>
+              <w:left w:type="dxa" w:w="70"/>
+              <w:bottom w:type="dxa" w:w="40"/>
+              <w:right w:type="dxa" w:w="70"/>
+            </w:tcMar>
+          </w:tcPr>
+          <w:p>
+            <w:pPr>
+              <w:spacing w:after="0" w:line="236"/>
+            </w:pPr>
+            <w:r>
+              <w:rPr>
+                <w:rFonts w:ascii="Arial" w:cs="Arial" w:eastAsia="Arial" w:hAnsi="Arial"/>
+                <w:b w:val="false"/>
+                <w:bCs w:val="false"/>
+                <w:sz w:val="19"/>
+                <w:szCs w:val="19"/>
+              </w:rPr>
+              <w:t xml:space="preserve">Barra lateral de navegación</w:t>
+            </w:r>
+          </w:p>
+        </w:tc>
+        <w:tc>
+          <w:tcPr>
+            <w:tcW w:type="dxa" w:w="2300"/>
+            <w:shd w:fill="FFFFFF" w:val="clear"/>
+            <w:tcMar>
+              <w:top w:type="dxa" w:w="40"/>
+              <w:left w:type="dxa" w:w="70"/>
+              <w:bottom w:type="dxa" w:w="40"/>
+              <w:right w:type="dxa" w:w="70"/>
+            </w:tcMar>
+          </w:tcPr>
+          <w:p>
+            <w:pPr>
+              <w:spacing w:after="0" w:line="236"/>
+            </w:pPr>
+            <w:r>
+              <w:rPr>
+                <w:rFonts w:ascii="Arial" w:cs="Arial" w:eastAsia="Arial" w:hAnsi="Arial"/>
+                <w:b w:val="false"/>
+                <w:bCs w:val="false"/>
+                <w:sz w:val="19"/>
+                <w:szCs w:val="19"/>
+              </w:rPr>
+              <w:t xml:space="preserve">Sobre azul primario</w:t>
+            </w:r>
+          </w:p>
+        </w:tc>
+        <w:tc>
+          <w:tcPr>
+            <w:tcW w:type="dxa" w:w="4560"/>
+            <w:shd w:fill="FFFFFF" w:val="clear"/>
+            <w:tcMar>
+              <w:top w:type="dxa" w:w="40"/>
+              <w:left w:type="dxa" w:w="70"/>
+              <w:bottom w:type="dxa" w:w="40"/>
+              <w:right w:type="dxa" w:w="70"/>
+            </w:tcMar>
+          </w:tcPr>
+          <w:p>
+            <w:pPr>
+              <w:spacing w:after="0" w:line="236"/>
+            </w:pPr>
+            <w:r>
+              <w:rPr>
+                <w:rFonts w:ascii="Arial" w:cs="Arial" w:eastAsia="Arial" w:hAnsi="Arial"/>
+                <w:b w:val="false"/>
+                <w:bCs w:val="false"/>
+                <w:sz w:val="19"/>
+                <w:szCs w:val="19"/>
+              </w:rPr>
+              <w:t xml:space="preserve">Fija en la parte superior; identifica la aplicación en todo momento.</w:t>
+            </w:r>
+          </w:p>
+        </w:tc>
+      </w:tr>
+      <w:tr>
+        <w:trPr>
+          <w:tblHeader w:val="false"/>
+        </w:trPr>
+        <w:tc>
+          <w:tcPr>
+            <w:tcW w:type="dxa" w:w="2500"/>
+            <w:shd w:fill="F2F2F2" w:val="clear"/>
+            <w:tcMar>
+              <w:top w:type="dxa" w:w="40"/>
+              <w:left w:type="dxa" w:w="70"/>
+              <w:bottom w:type="dxa" w:w="40"/>
+              <w:right w:type="dxa" w:w="70"/>
+            </w:tcMar>
+          </w:tcPr>
+          <w:p>
+            <w:pPr>
+              <w:spacing w:after="0" w:line="236"/>
+            </w:pPr>
+            <w:r>
+              <w:rPr>
+                <w:rFonts w:ascii="Arial" w:cs="Arial" w:eastAsia="Arial" w:hAnsi="Arial"/>
+                <w:b w:val="false"/>
+                <w:bCs w:val="false"/>
+                <w:sz w:val="19"/>
+                <w:szCs w:val="19"/>
+              </w:rPr>
+              <w:t xml:space="preserve">Pantallas de acceso y registro</w:t>
+            </w:r>
+          </w:p>
+        </w:tc>
+        <w:tc>
+          <w:tcPr>
+            <w:tcW w:type="dxa" w:w="2300"/>
+            <w:shd w:fill="F2F2F2" w:val="clear"/>
+            <w:tcMar>
+              <w:top w:type="dxa" w:w="40"/>
+              <w:left w:type="dxa" w:w="70"/>
+              <w:bottom w:type="dxa" w:w="40"/>
+              <w:right w:type="dxa" w:w="70"/>
+            </w:tcMar>
+          </w:tcPr>
+          <w:p>
+            <w:pPr>
+              <w:spacing w:after="0" w:line="236"/>
+            </w:pPr>
+            <w:r>
+              <w:rPr>
+                <w:rFonts w:ascii="Arial" w:cs="Arial" w:eastAsia="Arial" w:hAnsi="Arial"/>
+                <w:b w:val="false"/>
+                <w:bCs w:val="false"/>
+                <w:sz w:val="19"/>
+                <w:szCs w:val="19"/>
+              </w:rPr>
+              <w:t xml:space="preserve">Principal, en el panel de marca</w:t>
+            </w:r>
+          </w:p>
+        </w:tc>
+        <w:tc>
+          <w:tcPr>
+            <w:tcW w:type="dxa" w:w="4560"/>
+            <w:shd w:fill="F2F2F2" w:val="clear"/>
+            <w:tcMar>
+              <w:top w:type="dxa" w:w="40"/>
+              <w:left w:type="dxa" w:w="70"/>
+              <w:bottom w:type="dxa" w:w="40"/>
+              <w:right w:type="dxa" w:w="70"/>
+            </w:tcMar>
+          </w:tcPr>
+          <w:p>
+            <w:pPr>
+              <w:spacing w:after="0" w:line="236"/>
+            </w:pPr>
+            <w:r>
+              <w:rPr>
+                <w:rFonts w:ascii="Arial" w:cs="Arial" w:eastAsia="Arial" w:hAnsi="Arial"/>
+                <w:b w:val="false"/>
+                <w:bCs w:val="false"/>
+                <w:sz w:val="19"/>
+                <w:szCs w:val="19"/>
+              </w:rPr>
+              <w:t xml:space="preserve">Acompaña la propuesta de valor mientras el usuario ingresa o se registra.</w:t>
+            </w:r>
+          </w:p>
+        </w:tc>
+      </w:tr>
+      <w:tr>
+        <w:trPr>
+          <w:tblHeader w:val="false"/>
+        </w:trPr>
+        <w:tc>
+          <w:tcPr>
+            <w:tcW w:type="dxa" w:w="2500"/>
+            <w:shd w:fill="FFFFFF" w:val="clear"/>
+            <w:tcMar>
+              <w:top w:type="dxa" w:w="40"/>
+              <w:left w:type="dxa" w:w="70"/>
+              <w:bottom w:type="dxa" w:w="40"/>
+              <w:right w:type="dxa" w:w="70"/>
+            </w:tcMar>
+          </w:tcPr>
+          <w:p>
+            <w:pPr>
+              <w:spacing w:after="0" w:line="236"/>
+            </w:pPr>
+            <w:r>
+              <w:rPr>
+                <w:rFonts w:ascii="Arial" w:cs="Arial" w:eastAsia="Arial" w:hAnsi="Arial"/>
+                <w:b w:val="false"/>
+                <w:bCs w:val="false"/>
+                <w:sz w:val="19"/>
+                <w:szCs w:val="19"/>
+              </w:rPr>
+              <w:t xml:space="preserve">Página de presentación</w:t>
+            </w:r>
+          </w:p>
+        </w:tc>
+        <w:tc>
+          <w:tcPr>
+            <w:tcW w:type="dxa" w:w="2300"/>
+            <w:shd w:fill="FFFFFF" w:val="clear"/>
+            <w:tcMar>
+              <w:top w:type="dxa" w:w="40"/>
+              <w:left w:type="dxa" w:w="70"/>
+              <w:bottom w:type="dxa" w:w="40"/>
+              <w:right w:type="dxa" w:w="70"/>
+            </w:tcMar>
+          </w:tcPr>
+          <w:p>
+            <w:pPr>
+              <w:spacing w:after="0" w:line="236"/>
+            </w:pPr>
+            <w:r>
+              <w:rPr>
+                <w:rFonts w:ascii="Arial" w:cs="Arial" w:eastAsia="Arial" w:hAnsi="Arial"/>
+                <w:b w:val="false"/>
+                <w:bCs w:val="false"/>
+                <w:sz w:val="19"/>
+                <w:szCs w:val="19"/>
+              </w:rPr>
+              <w:t xml:space="preserve">Principal y sobre azul primario</w:t>
+            </w:r>
+          </w:p>
+        </w:tc>
+        <w:tc>
+          <w:tcPr>
+            <w:tcW w:type="dxa" w:w="4560"/>
+            <w:shd w:fill="FFFFFF" w:val="clear"/>
+            <w:tcMar>
+              <w:top w:type="dxa" w:w="40"/>
+              <w:left w:type="dxa" w:w="70"/>
+              <w:bottom w:type="dxa" w:w="40"/>
+              <w:right w:type="dxa" w:w="70"/>
+            </w:tcMar>
+          </w:tcPr>
+          <w:p>
+            <w:pPr>
+              <w:spacing w:after="0" w:line="236"/>
+            </w:pPr>
+            <w:r>
+              <w:rPr>
+                <w:rFonts w:ascii="Arial" w:cs="Arial" w:eastAsia="Arial" w:hAnsi="Arial"/>
+                <w:b w:val="false"/>
+                <w:bCs w:val="false"/>
+                <w:sz w:val="19"/>
+                <w:szCs w:val="19"/>
+              </w:rPr>
+              <w:t xml:space="preserve">En la barra superior y en el pie de la página.</w:t>
+            </w:r>
+          </w:p>
+        </w:tc>
+      </w:tr>
+      <w:tr>
+        <w:trPr>
+          <w:tblHeader w:val="false"/>
+        </w:trPr>
+        <w:tc>
+          <w:tcPr>
+            <w:tcW w:type="dxa" w:w="2500"/>
+            <w:shd w:fill="F2F2F2" w:val="clear"/>
+            <w:tcMar>
+              <w:top w:type="dxa" w:w="40"/>
+              <w:left w:type="dxa" w:w="70"/>
+              <w:bottom w:type="dxa" w:w="40"/>
+              <w:right w:type="dxa" w:w="70"/>
+            </w:tcMar>
+          </w:tcPr>
+          <w:p>
+            <w:pPr>
+              <w:spacing w:after="0" w:line="236"/>
+            </w:pPr>
+            <w:r>
+              <w:rPr>
+                <w:rFonts w:ascii="Arial" w:cs="Arial" w:eastAsia="Arial" w:hAnsi="Arial"/>
+                <w:b w:val="false"/>
+                <w:bCs w:val="false"/>
+                <w:sz w:val="19"/>
+                <w:szCs w:val="19"/>
+              </w:rPr>
+              <w:t xml:space="preserve">Icono de la aplicación y avatar</w:t>
+            </w:r>
+          </w:p>
+        </w:tc>
+        <w:tc>
+          <w:tcPr>
+            <w:tcW w:type="dxa" w:w="2300"/>
+            <w:shd w:fill="F2F2F2" w:val="clear"/>
+            <w:tcMar>
+              <w:top w:type="dxa" w:w="40"/>
+              <w:left w:type="dxa" w:w="70"/>
+              <w:bottom w:type="dxa" w:w="40"/>
+              <w:right w:type="dxa" w:w="70"/>
+            </w:tcMar>
+          </w:tcPr>
+          <w:p>
+            <w:pPr>
+              <w:spacing w:after="0" w:line="236"/>
+            </w:pPr>
+            <w:r>
+              <w:rPr>
+                <w:rFonts w:ascii="Arial" w:cs="Arial" w:eastAsia="Arial" w:hAnsi="Arial"/>
+                <w:b w:val="false"/>
+                <w:bCs w:val="false"/>
+                <w:sz w:val="19"/>
+                <w:szCs w:val="19"/>
+              </w:rPr>
+              <w:t xml:space="preserve">Símbolo solo</w:t>
+            </w:r>
+          </w:p>
+        </w:tc>
+        <w:tc>
+          <w:tcPr>
+            <w:tcW w:type="dxa" w:w="4560"/>
+            <w:shd w:fill="F2F2F2" w:val="clear"/>
+            <w:tcMar>
+              <w:top w:type="dxa" w:w="40"/>
+              <w:left w:type="dxa" w:w="70"/>
+              <w:bottom w:type="dxa" w:w="40"/>
+              <w:right w:type="dxa" w:w="70"/>
+            </w:tcMar>
+          </w:tcPr>
+          <w:p>
+            <w:pPr>
+              <w:spacing w:after="0" w:line="236"/>
+            </w:pPr>
+            <w:r>
+              <w:rPr>
+                <w:rFonts w:ascii="Arial" w:cs="Arial" w:eastAsia="Arial" w:hAnsi="Arial"/>
+                <w:b w:val="false"/>
+                <w:bCs w:val="false"/>
+                <w:sz w:val="19"/>
+                <w:szCs w:val="19"/>
+              </w:rPr>
+              <w:t xml:space="preserve">Sobre fondo azul primario, con las esquinas redondeadas del sistema.</w:t>
+            </w:r>
+          </w:p>
+        </w:tc>
+      </w:tr>
+      <w:tr>
+        <w:trPr>
+          <w:tblHeader w:val="false"/>
+        </w:trPr>
+        <w:tc>
+          <w:tcPr>
+            <w:tcW w:type="dxa" w:w="2500"/>
+            <w:shd w:fill="FFFFFF" w:val="clear"/>
+            <w:tcMar>
+              <w:top w:type="dxa" w:w="40"/>
+              <w:left w:type="dxa" w:w="70"/>
+              <w:bottom w:type="dxa" w:w="40"/>
+              <w:right w:type="dxa" w:w="70"/>
+            </w:tcMar>
+          </w:tcPr>
+          <w:p>
+            <w:pPr>
+              <w:spacing w:after="0" w:line="236"/>
+            </w:pPr>
+            <w:r>
+              <w:rPr>
+                <w:rFonts w:ascii="Arial" w:cs="Arial" w:eastAsia="Arial" w:hAnsi="Arial"/>
+                <w:b w:val="false"/>
+                <w:bCs w:val="false"/>
+                <w:sz w:val="19"/>
+                <w:szCs w:val="19"/>
+              </w:rPr>
+              <w:t xml:space="preserve">Comprobantes y reportes exportados</w:t>
+            </w:r>
+          </w:p>
+        </w:tc>
+        <w:tc>
+          <w:tcPr>
+            <w:tcW w:type="dxa" w:w="2300"/>
+            <w:shd w:fill="FFFFFF" w:val="clear"/>
+            <w:tcMar>
+              <w:top w:type="dxa" w:w="40"/>
+              <w:left w:type="dxa" w:w="70"/>
+              <w:bottom w:type="dxa" w:w="40"/>
+              <w:right w:type="dxa" w:w="70"/>
+            </w:tcMar>
+          </w:tcPr>
+          <w:p>
+            <w:pPr>
+              <w:spacing w:after="0" w:line="236"/>
+            </w:pPr>
+            <w:r>
+              <w:rPr>
+                <w:rFonts w:ascii="Arial" w:cs="Arial" w:eastAsia="Arial" w:hAnsi="Arial"/>
+                <w:b w:val="false"/>
+                <w:bCs w:val="false"/>
+                <w:sz w:val="19"/>
+                <w:szCs w:val="19"/>
+              </w:rPr>
+              <w:t xml:space="preserve">Principal, en el encabezado</w:t>
+            </w:r>
+          </w:p>
+        </w:tc>
+        <w:tc>
+          <w:tcPr>
+            <w:tcW w:type="dxa" w:w="4560"/>
+            <w:shd w:fill="FFFFFF" w:val="clear"/>
+            <w:tcMar>
+              <w:top w:type="dxa" w:w="40"/>
+              <w:left w:type="dxa" w:w="70"/>
+              <w:bottom w:type="dxa" w:w="40"/>
+              <w:right w:type="dxa" w:w="70"/>
+            </w:tcMar>
+          </w:tcPr>
+          <w:p>
+            <w:pPr>
+              <w:spacing w:after="0" w:line="236"/>
+            </w:pPr>
+            <w:r>
+              <w:rPr>
+                <w:rFonts w:ascii="Arial" w:cs="Arial" w:eastAsia="Arial" w:hAnsi="Arial"/>
+                <w:b w:val="false"/>
+                <w:bCs w:val="false"/>
+                <w:sz w:val="19"/>
+                <w:szCs w:val="19"/>
+              </w:rPr>
+              <w:t xml:space="preserve">Con el nombre de la licorera junto al logotipo, sin competir con él.</w:t>
+            </w:r>
+          </w:p>
+        </w:tc>
+      </w:tr>
+    </w:tbl>
+    <w:p>
+      <w:pPr>
+        <w:spacing w:after="110" w:line="262"/>
+        <w:jc w:val="both"/>
+      </w:pPr>
+      <w:r>
+        <w:rPr>
+          <w:rFonts w:ascii="Arial" w:cs="Arial" w:eastAsia="Arial" w:hAnsi="Arial"/>
+          <w:sz w:val="22"/>
+          <w:szCs w:val="22"/>
+        </w:rPr>
+        <w:t xml:space="preserve">Dentro de la aplicación el logotipo no se usa como icono de una función, no se repite en cada pantalla ni se emplea como elemento decorativo de fondo.</w:t>
+      </w:r>
+    </w:p>
+    <w:p>
+      <w:pPr>
+        <w:spacing w:after="110" w:line="262"/>
+        <w:jc w:val="both"/>
+      </w:pPr>
+      <w:r>
+        <w:rPr>
+          <w:rFonts w:ascii="Arial" w:cs="Arial" w:eastAsia="Arial" w:hAnsi="Arial"/>
+          <w:sz w:val="22"/>
+          <w:szCs w:val="22"/>
+        </w:rPr>
+        <w:t xml:space="preserve">Los demás criterios visuales del producto —componentes, estados, rejilla, comportamiento responsivo y mensajes— están definidos en el documento técnico de diseño, que desarrolla en detalle lo que aquí se establece como marca.</w:t>
+      </w:r>
+    </w:p>
+    <w:p>
+      <w:pPr>
+        <w:pStyle w:val="Heading1"/>
+        <w:pageBreakBefore/>
+        <w:spacing w:after="110" w:before="220"/>
+      </w:pPr>
+      <w:bookmarkStart w:name="bm36" w:id="36"/>
+      <w:r>
+        <w:rPr>
+          <w:rFonts w:ascii="Arial" w:cs="Arial" w:eastAsia="Arial" w:hAnsi="Arial"/>
+          <w:b/>
+          <w:bCs/>
+          <w:color w:val="1F3864"/>
+          <w:sz w:val="27"/>
+          <w:szCs w:val="27"/>
+        </w:rPr>
+        <w:t xml:space="preserve">11. Piezas de comunicación</w:t>
+      </w:r>
+      <w:bookmarkEnd w:id="36"/>
+    </w:p>
+    <w:p>
+      <w:pPr>
+        <w:pStyle w:val="Heading2"/>
+        <w:spacing w:after="80" w:before="150"/>
+      </w:pPr>
+      <w:bookmarkStart w:name="bm37" w:id="37"/>
+      <w:r>
+        <w:rPr>
+          <w:rFonts w:ascii="Arial" w:cs="Arial" w:eastAsia="Arial" w:hAnsi="Arial"/>
+          <w:b/>
+          <w:bCs/>
+          <w:color w:val="2E5496"/>
+          <w:sz w:val="23"/>
+          <w:szCs w:val="23"/>
+        </w:rPr>
+        <w:t xml:space="preserve">11.1 Aplicaciones básicas</w:t>
+      </w:r>
+      <w:bookmarkEnd w:id="37"/>
+    </w:p>
+    <w:p>
+      <w:pPr>
+        <w:spacing w:after="110" w:line="262"/>
+        <w:jc w:val="both"/>
+      </w:pPr>
+      <w:r>
+        <w:rPr>
+          <w:rFonts w:ascii="Arial" w:cs="Arial" w:eastAsia="Arial" w:hAnsi="Arial"/>
+          <w:sz w:val="22"/>
+          <w:szCs w:val="22"/>
+        </w:rPr>
+        <w:t xml:space="preserve">El repertorio de piezas es corto y responde a la operación real del negocio: la visita comercial, el correo al cliente y la presencia en redes. Todas se construyen con los mismos elementos ya definidos y no incorporan recursos gráficos ajenos al sistema.</w:t>
+      </w:r>
+    </w:p>
+    <w:p>
+      <w:pPr>
+        <w:spacing w:after="20" w:before="60"/>
+        <w:jc w:val="center"/>
+      </w:pPr>
+      <w:r>
+        <w:drawing>
+          <wp:inline distT="0" distB="0" distL="0" distR="0">
+            <wp:extent cx="5905500" cy="3086100"/>
+            <wp:effectExtent t="0" r="0" b="0" l="0"/>
+            <wp:docPr id="1" name="" descr="" title=""/>
+            <wp:cNvGraphicFramePr>
+              <a:graphicFrameLocks xmlns:a="http://schemas.openxmlformats.org/drawingml/2006/main" noChangeAspect="1"/>
+            </wp:cNvGraphicFramePr>
+            <a:graphic xmlns:a="http://schemas.openxmlformats.org/drawingml/2006/main">
+              <a:graphicData uri="http://schemas.openxmlformats.org/drawingml/2006/picture">
+                <pic:pic xmlns:pic="http://schemas.openxmlformats.org/drawingml/2006/picture">
+                  <pic:nvPicPr>
+                    <pic:cNvPr id="0" name="" descr=""/>
+                    <pic:cNvPicPr>
+                      <a:picLocks noChangeAspect="1" noChangeArrowheads="1"/>
+                    </pic:cNvPicPr>
+                  </pic:nvPicPr>
+                  <pic:blipFill>
+                    <a:blip r:embed="rId16" cstate="none"/>
+                    <a:srcRect/>
+                    <a:stretch>
+                      <a:fillRect/>
+                    </a:stretch>
+                  </pic:blipFill>
+                  <pic:spPr bwMode="auto">
+                    <a:xfrm>
+                      <a:off x="0" y="0"/>
+                      <a:ext cx="5905500" cy="3086100"/>
+                    </a:xfrm>
+                    <a:prstGeom prst="rect">
+                      <a:avLst/>
+                    </a:prstGeom>
+                  </pic:spPr>
+                </pic:pic>
+              </a:graphicData>
+            </a:graphic>
+          </wp:inline>
+        </w:drawing>
+      </w:r>
+    </w:p>
+    <w:p>
+      <w:pPr>
+        <w:spacing w:after="150" w:before="6"/>
+        <w:jc w:val="center"/>
+      </w:pPr>
+      <w:r>
+        <w:rPr>
+          <w:rFonts w:ascii="Arial" w:cs="Arial" w:eastAsia="Arial" w:hAnsi="Arial"/>
+          <w:i/>
+          <w:iCs/>
+          <w:color w:val="5B6678"/>
+          <w:sz w:val="18"/>
+          <w:szCs w:val="18"/>
+        </w:rPr>
+        <w:t xml:space="preserve">Figura 9. Aplicaciones básicas de la marca. Fuente: del autor.</w:t>
+      </w:r>
+    </w:p>
+    <w:p>
+      <w:pPr>
+        <w:pStyle w:val="ListParagraph"/>
+        <w:numPr>
+          <w:ilvl w:val="0"/>
+          <w:numId w:val="1"/>
+        </w:numPr>
+        <w:spacing w:after="60" w:line="258"/>
+      </w:pPr>
+      <w:r>
+        <w:rPr>
+          <w:rFonts w:ascii="Arial" w:cs="Arial" w:eastAsia="Arial" w:hAnsi="Arial"/>
+          <w:b/>
+          <w:bCs/>
+          <w:sz w:val="22"/>
+          <w:szCs w:val="22"/>
+        </w:rPr>
+        <w:t xml:space="preserve">Tarjeta de presentación. </w:t>
+      </w:r>
+      <w:r>
+        <w:rPr>
+          <w:rFonts w:ascii="Arial" w:cs="Arial" w:eastAsia="Arial" w:hAnsi="Arial"/>
+          <w:sz w:val="22"/>
+          <w:szCs w:val="22"/>
+        </w:rPr>
+        <w:t xml:space="preserve">Frente en azul primario con el logotipo centrado; reverso en blanco con el nombre, el cargo y los datos de contacto, separados por una línea corta en verde.</w:t>
+      </w:r>
+    </w:p>
+    <w:p>
+      <w:pPr>
+        <w:pStyle w:val="ListParagraph"/>
+        <w:numPr>
+          <w:ilvl w:val="0"/>
+          <w:numId w:val="1"/>
+        </w:numPr>
+        <w:spacing w:after="60" w:line="258"/>
+      </w:pPr>
+      <w:r>
+        <w:rPr>
+          <w:rFonts w:ascii="Arial" w:cs="Arial" w:eastAsia="Arial" w:hAnsi="Arial"/>
+          <w:b/>
+          <w:bCs/>
+          <w:sz w:val="22"/>
+          <w:szCs w:val="22"/>
+        </w:rPr>
+        <w:t xml:space="preserve">Firma de correo. </w:t>
+      </w:r>
+      <w:r>
+        <w:rPr>
+          <w:rFonts w:ascii="Arial" w:cs="Arial" w:eastAsia="Arial" w:hAnsi="Arial"/>
+          <w:sz w:val="22"/>
+          <w:szCs w:val="22"/>
+        </w:rPr>
+        <w:t xml:space="preserve">Logotipo en su versión principal, una línea divisoria y los datos de contacto en una sola línea de texto secundario.</w:t>
+      </w:r>
+    </w:p>
+    <w:p>
+      <w:pPr>
+        <w:pStyle w:val="ListParagraph"/>
+        <w:numPr>
+          <w:ilvl w:val="0"/>
+          <w:numId w:val="1"/>
+        </w:numPr>
+        <w:spacing w:after="60" w:line="258"/>
+      </w:pPr>
+      <w:r>
+        <w:rPr>
+          <w:rFonts w:ascii="Arial" w:cs="Arial" w:eastAsia="Arial" w:hAnsi="Arial"/>
+          <w:b/>
+          <w:bCs/>
+          <w:sz w:val="22"/>
+          <w:szCs w:val="22"/>
+        </w:rPr>
+        <w:t xml:space="preserve">Icono de la aplicación y avatar. </w:t>
+      </w:r>
+      <w:r>
+        <w:rPr>
+          <w:rFonts w:ascii="Arial" w:cs="Arial" w:eastAsia="Arial" w:hAnsi="Arial"/>
+          <w:sz w:val="22"/>
+          <w:szCs w:val="22"/>
+        </w:rPr>
+        <w:t xml:space="preserve">Símbolo solo sobre azul primario, en cuadrado de esquinas redondeadas para el icono y en círculo para el avatar de redes.</w:t>
+      </w:r>
+    </w:p>
+    <w:p>
+      <w:pPr>
+        <w:pStyle w:val="ListParagraph"/>
+        <w:numPr>
+          <w:ilvl w:val="0"/>
+          <w:numId w:val="1"/>
+        </w:numPr>
+        <w:spacing w:after="60" w:line="258"/>
+      </w:pPr>
+      <w:r>
+        <w:rPr>
+          <w:rFonts w:ascii="Arial" w:cs="Arial" w:eastAsia="Arial" w:hAnsi="Arial"/>
+          <w:b/>
+          <w:bCs/>
+          <w:sz w:val="22"/>
+          <w:szCs w:val="22"/>
+        </w:rPr>
+        <w:t xml:space="preserve">Documentos y presentaciones. </w:t>
+      </w:r>
+      <w:r>
+        <w:rPr>
+          <w:rFonts w:ascii="Arial" w:cs="Arial" w:eastAsia="Arial" w:hAnsi="Arial"/>
+          <w:sz w:val="22"/>
+          <w:szCs w:val="22"/>
+        </w:rPr>
+        <w:t xml:space="preserve">Portada con el logotipo y el título; interior con la tipografía y los colores del sistema. Los documentos de este proyecto siguen ese mismo criterio.</w:t>
+      </w:r>
+    </w:p>
+    <w:p>
+      <w:pPr>
+        <w:pStyle w:val="Heading2"/>
+        <w:spacing w:after="80" w:before="150"/>
+      </w:pPr>
+      <w:bookmarkStart w:name="bm38" w:id="38"/>
+      <w:r>
+        <w:rPr>
+          <w:rFonts w:ascii="Arial" w:cs="Arial" w:eastAsia="Arial" w:hAnsi="Arial"/>
+          <w:b/>
+          <w:bCs/>
+          <w:color w:val="2E5496"/>
+          <w:sz w:val="23"/>
+          <w:szCs w:val="23"/>
+        </w:rPr>
+        <w:t xml:space="preserve">11.2 Cómo producir una pieza nueva</w:t>
+      </w:r>
+      <w:bookmarkEnd w:id="38"/>
+    </w:p>
+    <w:p>
+      <w:pPr>
+        <w:spacing w:after="110" w:line="262"/>
+        <w:jc w:val="both"/>
+      </w:pPr>
+      <w:r>
+        <w:rPr>
+          <w:rFonts w:ascii="Arial" w:cs="Arial" w:eastAsia="Arial" w:hAnsi="Arial"/>
+          <w:sz w:val="22"/>
+          <w:szCs w:val="22"/>
+        </w:rPr>
+        <w:t xml:space="preserve">Cuando se requiera una pieza que no esté prevista aquí, basta con seguir cinco pasos:</w:t>
+      </w:r>
+    </w:p>
+    <w:p>
+      <w:pPr>
+        <w:pStyle w:val="ListParagraph"/>
+        <w:numPr>
+          <w:ilvl w:val="0"/>
+          <w:numId w:val="1"/>
+        </w:numPr>
+        <w:spacing w:after="60" w:line="258"/>
+      </w:pPr>
+      <w:r>
+        <w:rPr>
+          <w:rFonts w:ascii="Arial" w:cs="Arial" w:eastAsia="Arial" w:hAnsi="Arial"/>
+          <w:sz w:val="22"/>
+          <w:szCs w:val="22"/>
+        </w:rPr>
+        <w:t xml:space="preserve">Definir la única idea que la pieza debe comunicar y escribirla en una frase, con la voz descrita en el apartado 4.</w:t>
+      </w:r>
+    </w:p>
+    <w:p>
+      <w:pPr>
+        <w:pStyle w:val="ListParagraph"/>
+        <w:numPr>
+          <w:ilvl w:val="0"/>
+          <w:numId w:val="1"/>
+        </w:numPr>
+        <w:spacing w:after="60" w:line="258"/>
+      </w:pPr>
+      <w:r>
+        <w:rPr>
+          <w:rFonts w:ascii="Arial" w:cs="Arial" w:eastAsia="Arial" w:hAnsi="Arial"/>
+          <w:sz w:val="22"/>
+          <w:szCs w:val="22"/>
+        </w:rPr>
+        <w:t xml:space="preserve">Elegir la versión del logotipo según el fondo y respetar su área de protección.</w:t>
+      </w:r>
+    </w:p>
+    <w:p>
+      <w:pPr>
+        <w:pStyle w:val="ListParagraph"/>
+        <w:numPr>
+          <w:ilvl w:val="0"/>
+          <w:numId w:val="1"/>
+        </w:numPr>
+        <w:spacing w:after="60" w:line="258"/>
+      </w:pPr>
+      <w:r>
+        <w:rPr>
+          <w:rFonts w:ascii="Arial" w:cs="Arial" w:eastAsia="Arial" w:hAnsi="Arial"/>
+          <w:sz w:val="22"/>
+          <w:szCs w:val="22"/>
+        </w:rPr>
+        <w:t xml:space="preserve">Aplicar la proporción de color: fondo claro, azul en la estructura y verde solo en el punto que se quiere destacar.</w:t>
+      </w:r>
+    </w:p>
+    <w:p>
+      <w:pPr>
+        <w:pStyle w:val="ListParagraph"/>
+        <w:numPr>
+          <w:ilvl w:val="0"/>
+          <w:numId w:val="1"/>
+        </w:numPr>
+        <w:spacing w:after="60" w:line="258"/>
+      </w:pPr>
+      <w:r>
+        <w:rPr>
+          <w:rFonts w:ascii="Arial" w:cs="Arial" w:eastAsia="Arial" w:hAnsi="Arial"/>
+          <w:sz w:val="22"/>
+          <w:szCs w:val="22"/>
+        </w:rPr>
+        <w:t xml:space="preserve">Componer con la escala tipográfica, sin mezclar más de dos pesos.</w:t>
+      </w:r>
+    </w:p>
+    <w:p>
+      <w:pPr>
+        <w:pStyle w:val="ListParagraph"/>
+        <w:numPr>
+          <w:ilvl w:val="0"/>
+          <w:numId w:val="1"/>
+        </w:numPr>
+        <w:spacing w:after="60" w:line="258"/>
+      </w:pPr>
+      <w:r>
+        <w:rPr>
+          <w:rFonts w:ascii="Arial" w:cs="Arial" w:eastAsia="Arial" w:hAnsi="Arial"/>
+          <w:sz w:val="22"/>
+          <w:szCs w:val="22"/>
+        </w:rPr>
+        <w:t xml:space="preserve">Dejar aire: si la pieza se ve apretada, se quita contenido antes que reducir los márgenes.</w:t>
+      </w:r>
+    </w:p>
+    <w:p>
+      <w:pPr>
+        <w:spacing w:after="110" w:line="262"/>
+        <w:jc w:val="both"/>
+      </w:pPr>
+      <w:r>
+        <w:rPr>
+          <w:rFonts w:ascii="Arial" w:cs="Arial" w:eastAsia="Arial" w:hAnsi="Arial"/>
+          <w:sz w:val="22"/>
+          <w:szCs w:val="22"/>
+        </w:rPr>
+        <w:t xml:space="preserve">Toda pieza debe revisarse antes de publicarse: ortografía, coherencia de los datos con el modelo de negocio y contraste suficiente entre el texto y su fondo.</w:t>
+      </w:r>
+    </w:p>
+    <w:p>
+      <w:pPr>
+        <w:pStyle w:val="Heading1"/>
+        <w:pageBreakBefore/>
+        <w:spacing w:after="110" w:before="220"/>
+      </w:pPr>
+      <w:bookmarkStart w:name="bm39" w:id="39"/>
+      <w:r>
+        <w:rPr>
+          <w:rFonts w:ascii="Arial" w:cs="Arial" w:eastAsia="Arial" w:hAnsi="Arial"/>
+          <w:b/>
+          <w:bCs/>
+          <w:color w:val="1F3864"/>
+          <w:sz w:val="27"/>
+          <w:szCs w:val="27"/>
+        </w:rPr>
+        <w:t xml:space="preserve">12. Derechos de autor y créditos</w:t>
+      </w:r>
+      <w:bookmarkEnd w:id="39"/>
+    </w:p>
+    <w:p>
+      <w:pPr>
+        <w:spacing w:after="110" w:line="262"/>
+        <w:jc w:val="both"/>
+      </w:pPr>
+      <w:r>
+        <w:rPr>
+          <w:rFonts w:ascii="Arial" w:cs="Arial" w:eastAsia="Arial" w:hAnsi="Arial"/>
+          <w:sz w:val="22"/>
+          <w:szCs w:val="22"/>
+        </w:rPr>
+        <w:t xml:space="preserve">© 2026 Cristian Darío Macías Espitia. El logotipo, los textos, los diagramas, las figuras y las pantallas que componen la marca INVENTRA son material académico del trabajo de grado del programa de Análisis y Desarrollo de Software, y su uso o reproducción requiere autorización del autor.</w:t>
+      </w:r>
+    </w:p>
+    <w:p>
+      <w:pPr>
+        <w:spacing w:after="110" w:line="262"/>
+        <w:jc w:val="both"/>
+      </w:pPr>
+      <w:r>
+        <w:rPr>
+          <w:rFonts w:ascii="Arial" w:cs="Arial" w:eastAsia="Arial" w:hAnsi="Arial"/>
+          <w:sz w:val="22"/>
+          <w:szCs w:val="22"/>
+        </w:rPr>
+        <w:t xml:space="preserve">Los elementos de terceros empleados en el proyecto se relacionan a continuación con su origen y sus condiciones de uso:</w:t>
+      </w:r>
+    </w:p>
+    <w:tbl>
+      <w:tblPr>
+        <w:tblW w:type="dxa" w:w="9360"/>
+        <w:tblBorders>
+          <w:top w:val="single" w:color="9CA3AF" w:sz="6"/>
+          <w:left w:val="single" w:color="9CA3AF" w:sz="6"/>
+          <w:bottom w:val="single" w:color="9CA3AF" w:sz="6"/>
+          <w:right w:val="single" w:color="9CA3AF" w:sz="6"/>
+          <w:insideH w:val="single" w:color="9CA3AF" w:sz="6"/>
+          <w:insideV w:val="single" w:color="9CA3AF" w:sz="6"/>
+        </w:tblBorders>
+        <w:tblLayout w:type="fixed"/>
+      </w:tblPr>
+      <w:tblGrid>
+        <w:gridCol w:w="2600"/>
+        <w:gridCol w:w="6760"/>
+      </w:tblGrid>
+      <w:tr>
+        <w:trPr>
+          <w:tblHeader/>
+        </w:trPr>
+        <w:tc>
+          <w:tcPr>
+            <w:tcW w:type="dxa" w:w="2600"/>
+            <w:shd w:fill="1F3864" w:val="clear"/>
+            <w:tcMar>
+              <w:top w:type="dxa" w:w="40"/>
+              <w:left w:type="dxa" w:w="70"/>
+              <w:bottom w:type="dxa" w:w="40"/>
+              <w:right w:type="dxa" w:w="70"/>
+            </w:tcMar>
+          </w:tcPr>
+          <w:p>
+            <w:pPr>
+              <w:spacing w:after="0" w:line="236"/>
+            </w:pPr>
+            <w:r>
+              <w:rPr>
+                <w:rFonts w:ascii="Arial" w:cs="Arial" w:eastAsia="Arial" w:hAnsi="Arial"/>
+                <w:b/>
+                <w:bCs/>
+                <w:color w:val="FFFFFF"/>
+                <w:sz w:val="19"/>
+                <w:szCs w:val="19"/>
+              </w:rPr>
+              <w:t xml:space="preserve">Elemento</w:t>
+            </w:r>
+          </w:p>
+        </w:tc>
+        <w:tc>
+          <w:tcPr>
+            <w:tcW w:type="dxa" w:w="6760"/>
+            <w:shd w:fill="1F3864" w:val="clear"/>
+            <w:tcMar>
+              <w:top w:type="dxa" w:w="40"/>
+              <w:left w:type="dxa" w:w="70"/>
+              <w:bottom w:type="dxa" w:w="40"/>
+              <w:right w:type="dxa" w:w="70"/>
+            </w:tcMar>
+          </w:tcPr>
+          <w:p>
+            <w:pPr>
+              <w:spacing w:after="0" w:line="236"/>
+            </w:pPr>
+            <w:r>
+              <w:rPr>
+                <w:rFonts w:ascii="Arial" w:cs="Arial" w:eastAsia="Arial" w:hAnsi="Arial"/>
+                <w:b/>
+                <w:bCs/>
+                <w:color w:val="FFFFFF"/>
+                <w:sz w:val="19"/>
+                <w:szCs w:val="19"/>
+              </w:rPr>
+              <w:t xml:space="preserve">Origen y condiciones</w:t>
+            </w:r>
+          </w:p>
+        </w:tc>
+      </w:tr>
+      <w:tr>
+        <w:trPr>
+          <w:tblHeader w:val="false"/>
+        </w:trPr>
+        <w:tc>
+          <w:tcPr>
+            <w:tcW w:type="dxa" w:w="2600"/>
+            <w:shd w:fill="FFFFFF" w:val="clear"/>
+            <w:tcMar>
+              <w:top w:type="dxa" w:w="40"/>
+              <w:left w:type="dxa" w:w="70"/>
+              <w:bottom w:type="dxa" w:w="40"/>
+              <w:right w:type="dxa" w:w="70"/>
+            </w:tcMar>
+          </w:tcPr>
+          <w:p>
+            <w:pPr>
+              <w:spacing w:after="0" w:line="236"/>
+            </w:pPr>
+            <w:r>
+              <w:rPr>
+                <w:rFonts w:ascii="Arial" w:cs="Arial" w:eastAsia="Arial" w:hAnsi="Arial"/>
+                <w:b w:val="false"/>
+                <w:bCs w:val="false"/>
+                <w:sz w:val="19"/>
+                <w:szCs w:val="19"/>
+              </w:rPr>
+              <w:t xml:space="preserve">Familia tipográfica Inter</w:t>
+            </w:r>
+          </w:p>
+        </w:tc>
+        <w:tc>
+          <w:tcPr>
+            <w:tcW w:type="dxa" w:w="6760"/>
+            <w:shd w:fill="FFFFFF" w:val="clear"/>
+            <w:tcMar>
+              <w:top w:type="dxa" w:w="40"/>
+              <w:left w:type="dxa" w:w="70"/>
+              <w:bottom w:type="dxa" w:w="40"/>
+              <w:right w:type="dxa" w:w="70"/>
+            </w:tcMar>
+          </w:tcPr>
+          <w:p>
+            <w:pPr>
+              <w:spacing w:after="0" w:line="236"/>
+            </w:pPr>
+            <w:r>
+              <w:rPr>
+                <w:rFonts w:ascii="Arial" w:cs="Arial" w:eastAsia="Arial" w:hAnsi="Arial"/>
+                <w:b w:val="false"/>
+                <w:bCs w:val="false"/>
+                <w:sz w:val="19"/>
+                <w:szCs w:val="19"/>
+              </w:rPr>
+              <w:t xml:space="preserve">Creada por Rasmus Andersson. Distribución libre bajo la licencia SIL Open Font License, que permite su uso, modificación y redistribución.</w:t>
+            </w:r>
+          </w:p>
+        </w:tc>
+      </w:tr>
+      <w:tr>
+        <w:trPr>
+          <w:tblHeader w:val="false"/>
+        </w:trPr>
+        <w:tc>
+          <w:tcPr>
+            <w:tcW w:type="dxa" w:w="2600"/>
+            <w:shd w:fill="F2F2F2" w:val="clear"/>
+            <w:tcMar>
+              <w:top w:type="dxa" w:w="40"/>
+              <w:left w:type="dxa" w:w="70"/>
+              <w:bottom w:type="dxa" w:w="40"/>
+              <w:right w:type="dxa" w:w="70"/>
+            </w:tcMar>
+          </w:tcPr>
+          <w:p>
+            <w:pPr>
+              <w:spacing w:after="0" w:line="236"/>
+            </w:pPr>
+            <w:r>
+              <w:rPr>
+                <w:rFonts w:ascii="Arial" w:cs="Arial" w:eastAsia="Arial" w:hAnsi="Arial"/>
+                <w:b w:val="false"/>
+                <w:bCs w:val="false"/>
+                <w:sz w:val="19"/>
+                <w:szCs w:val="19"/>
+              </w:rPr>
+              <w:t xml:space="preserve">Iconos de la aplicación</w:t>
+            </w:r>
+          </w:p>
+        </w:tc>
+        <w:tc>
+          <w:tcPr>
+            <w:tcW w:type="dxa" w:w="6760"/>
+            <w:shd w:fill="F2F2F2" w:val="clear"/>
+            <w:tcMar>
+              <w:top w:type="dxa" w:w="40"/>
+              <w:left w:type="dxa" w:w="70"/>
+              <w:bottom w:type="dxa" w:w="40"/>
+              <w:right w:type="dxa" w:w="70"/>
+            </w:tcMar>
+          </w:tcPr>
+          <w:p>
+            <w:pPr>
+              <w:spacing w:after="0" w:line="236"/>
+            </w:pPr>
+            <w:r>
+              <w:rPr>
+                <w:rFonts w:ascii="Arial" w:cs="Arial" w:eastAsia="Arial" w:hAnsi="Arial"/>
+                <w:b w:val="false"/>
+                <w:bCs w:val="false"/>
+                <w:sz w:val="19"/>
+                <w:szCs w:val="19"/>
+              </w:rPr>
+              <w:t xml:space="preserve">Diseñados para el proyecto sobre una retícula de 24 píxeles. No proceden de una biblioteca de terceros.</w:t>
+            </w:r>
+          </w:p>
+        </w:tc>
+      </w:tr>
+      <w:tr>
+        <w:trPr>
+          <w:tblHeader w:val="false"/>
+        </w:trPr>
+        <w:tc>
+          <w:tcPr>
+            <w:tcW w:type="dxa" w:w="2600"/>
+            <w:shd w:fill="FFFFFF" w:val="clear"/>
+            <w:tcMar>
+              <w:top w:type="dxa" w:w="40"/>
+              <w:left w:type="dxa" w:w="70"/>
+              <w:bottom w:type="dxa" w:w="40"/>
+              <w:right w:type="dxa" w:w="70"/>
+            </w:tcMar>
+          </w:tcPr>
+          <w:p>
+            <w:pPr>
+              <w:spacing w:after="0" w:line="236"/>
+            </w:pPr>
+            <w:r>
+              <w:rPr>
+                <w:rFonts w:ascii="Arial" w:cs="Arial" w:eastAsia="Arial" w:hAnsi="Arial"/>
+                <w:b w:val="false"/>
+                <w:bCs w:val="false"/>
+                <w:sz w:val="19"/>
+                <w:szCs w:val="19"/>
+              </w:rPr>
+              <w:t xml:space="preserve">Marcas y nombres de empresas citadas</w:t>
+            </w:r>
+          </w:p>
+        </w:tc>
+        <w:tc>
+          <w:tcPr>
+            <w:tcW w:type="dxa" w:w="6760"/>
+            <w:shd w:fill="FFFFFF" w:val="clear"/>
+            <w:tcMar>
+              <w:top w:type="dxa" w:w="40"/>
+              <w:left w:type="dxa" w:w="70"/>
+              <w:bottom w:type="dxa" w:w="40"/>
+              <w:right w:type="dxa" w:w="70"/>
+            </w:tcMar>
+          </w:tcPr>
+          <w:p>
+            <w:pPr>
+              <w:spacing w:after="0" w:line="236"/>
+            </w:pPr>
+            <w:r>
+              <w:rPr>
+                <w:rFonts w:ascii="Arial" w:cs="Arial" w:eastAsia="Arial" w:hAnsi="Arial"/>
+                <w:b w:val="false"/>
+                <w:bCs w:val="false"/>
+                <w:sz w:val="19"/>
+                <w:szCs w:val="19"/>
+              </w:rPr>
+              <w:t xml:space="preserve">DIAN, y las plataformas y soluciones mencionadas como referencia o alternativa del mercado, pertenecen a sus respectivos titulares y se citan únicamente con fines de comparación y documentación.</w:t>
+            </w:r>
+          </w:p>
+        </w:tc>
+      </w:tr>
+      <w:tr>
+        <w:trPr>
+          <w:tblHeader w:val="false"/>
+        </w:trPr>
+        <w:tc>
+          <w:tcPr>
+            <w:tcW w:type="dxa" w:w="2600"/>
+            <w:shd w:fill="F2F2F2" w:val="clear"/>
+            <w:tcMar>
+              <w:top w:type="dxa" w:w="40"/>
+              <w:left w:type="dxa" w:w="70"/>
+              <w:bottom w:type="dxa" w:w="40"/>
+              <w:right w:type="dxa" w:w="70"/>
+            </w:tcMar>
+          </w:tcPr>
+          <w:p>
+            <w:pPr>
+              <w:spacing w:after="0" w:line="236"/>
+            </w:pPr>
+            <w:r>
+              <w:rPr>
+                <w:rFonts w:ascii="Arial" w:cs="Arial" w:eastAsia="Arial" w:hAnsi="Arial"/>
+                <w:b w:val="false"/>
+                <w:bCs w:val="false"/>
+                <w:sz w:val="19"/>
+                <w:szCs w:val="19"/>
+              </w:rPr>
+              <w:t xml:space="preserve">Nombres de productos en el prototipo</w:t>
+            </w:r>
+          </w:p>
+        </w:tc>
+        <w:tc>
+          <w:tcPr>
+            <w:tcW w:type="dxa" w:w="6760"/>
+            <w:shd w:fill="F2F2F2" w:val="clear"/>
+            <w:tcMar>
+              <w:top w:type="dxa" w:w="40"/>
+              <w:left w:type="dxa" w:w="70"/>
+              <w:bottom w:type="dxa" w:w="40"/>
+              <w:right w:type="dxa" w:w="70"/>
+            </w:tcMar>
+          </w:tcPr>
+          <w:p>
+            <w:pPr>
+              <w:spacing w:after="0" w:line="236"/>
+            </w:pPr>
+            <w:r>
+              <w:rPr>
+                <w:rFonts w:ascii="Arial" w:cs="Arial" w:eastAsia="Arial" w:hAnsi="Arial"/>
+                <w:b w:val="false"/>
+                <w:bCs w:val="false"/>
+                <w:sz w:val="19"/>
+                <w:szCs w:val="19"/>
+              </w:rPr>
+              <w:t xml:space="preserve">Los productos que aparecen en las pantallas son datos de ejemplo para ilustrar el funcionamiento. Las marcas comerciales de esos productos pertenecen a sus titulares y su aparición no implica vínculo, patrocinio ni autorización.</w:t>
+            </w:r>
+          </w:p>
+        </w:tc>
+      </w:tr>
+      <w:tr>
+        <w:trPr>
+          <w:tblHeader w:val="false"/>
+        </w:trPr>
+        <w:tc>
+          <w:tcPr>
+            <w:tcW w:type="dxa" w:w="2600"/>
+            <w:shd w:fill="FFFFFF" w:val="clear"/>
+            <w:tcMar>
+              <w:top w:type="dxa" w:w="40"/>
+              <w:left w:type="dxa" w:w="70"/>
+              <w:bottom w:type="dxa" w:w="40"/>
+              <w:right w:type="dxa" w:w="70"/>
+            </w:tcMar>
+          </w:tcPr>
+          <w:p>
+            <w:pPr>
+              <w:spacing w:after="0" w:line="236"/>
+            </w:pPr>
+            <w:r>
+              <w:rPr>
+                <w:rFonts w:ascii="Arial" w:cs="Arial" w:eastAsia="Arial" w:hAnsi="Arial"/>
+                <w:b w:val="false"/>
+                <w:bCs w:val="false"/>
+                <w:sz w:val="19"/>
+                <w:szCs w:val="19"/>
+              </w:rPr>
+              <w:t xml:space="preserve">Pautas y normas citadas</w:t>
+            </w:r>
+          </w:p>
+        </w:tc>
+        <w:tc>
+          <w:tcPr>
+            <w:tcW w:type="dxa" w:w="6760"/>
+            <w:shd w:fill="FFFFFF" w:val="clear"/>
+            <w:tcMar>
+              <w:top w:type="dxa" w:w="40"/>
+              <w:left w:type="dxa" w:w="70"/>
+              <w:bottom w:type="dxa" w:w="40"/>
+              <w:right w:type="dxa" w:w="70"/>
+            </w:tcMar>
+          </w:tcPr>
+          <w:p>
+            <w:pPr>
+              <w:spacing w:after="0" w:line="236"/>
+            </w:pPr>
+            <w:r>
+              <w:rPr>
+                <w:rFonts w:ascii="Arial" w:cs="Arial" w:eastAsia="Arial" w:hAnsi="Arial"/>
+                <w:b w:val="false"/>
+                <w:bCs w:val="false"/>
+                <w:sz w:val="19"/>
+                <w:szCs w:val="19"/>
+              </w:rPr>
+              <w:t xml:space="preserve">WCAG 2.1 del W3C, la norma IEEE 830 y las obras relacionadas en las referencias pertenecen a sus autores y organizaciones.</w:t>
+            </w:r>
+          </w:p>
+        </w:tc>
+      </w:tr>
+    </w:tbl>
+    <w:p>
+      <w:pPr>
+        <w:spacing w:after="110" w:line="262"/>
+        <w:jc w:val="both"/>
+      </w:pPr>
+      <w:r>
+        <w:rPr>
+          <w:rFonts w:ascii="Arial" w:cs="Arial" w:eastAsia="Arial" w:hAnsi="Arial"/>
+          <w:sz w:val="22"/>
+          <w:szCs w:val="22"/>
+        </w:rPr>
+        <w:t xml:space="preserve">Al producir una pieza nueva se mantiene este criterio: todo recurso que no sea propio se cita y se verifica que su licencia permita el uso previsto.</w:t>
+      </w:r>
+    </w:p>
+    <w:p>
+      <w:pPr>
+        <w:pStyle w:val="Heading1"/>
+        <w:pageBreakBefore/>
+        <w:spacing w:after="110" w:before="220"/>
+      </w:pPr>
+      <w:bookmarkStart w:name="bm40" w:id="40"/>
+      <w:r>
+        <w:rPr>
+          <w:rFonts w:ascii="Arial" w:cs="Arial" w:eastAsia="Arial" w:hAnsi="Arial"/>
+          <w:b/>
+          <w:bCs/>
+          <w:color w:val="1F3864"/>
+          <w:sz w:val="27"/>
+          <w:szCs w:val="27"/>
+        </w:rPr>
+        <w:t xml:space="preserve">13. Conclusión</w:t>
+      </w:r>
+      <w:bookmarkEnd w:id="40"/>
+    </w:p>
+    <w:p>
+      <w:pPr>
+        <w:spacing w:after="110" w:line="262"/>
+        <w:jc w:val="both"/>
+      </w:pPr>
+      <w:r>
+        <w:rPr>
+          <w:rFonts w:ascii="Arial" w:cs="Arial" w:eastAsia="Arial" w:hAnsi="Arial"/>
+          <w:sz w:val="22"/>
+          <w:szCs w:val="22"/>
+        </w:rPr>
+        <w:t xml:space="preserve">Este manual deja definida la marca INVENTRA en sus tres dimensiones. La primera es la identidad de fondo: a quién se dirige, qué promete, con qué atributos quiere ser reconocida y cómo habla. La segunda es la identidad visual: el logotipo con sus versiones y restricciones, el color con sus proporciones y sus combinaciones verificadas, la tipografía y la iconografía. La tercera son las aplicaciones: cómo se presenta la marca en el producto y en las piezas de comunicación, y qué condiciones de autoría deben respetarse.</w:t>
+      </w:r>
+    </w:p>
+    <w:p>
+      <w:pPr>
+        <w:spacing w:after="110" w:line="262"/>
+        <w:jc w:val="both"/>
+      </w:pPr>
+      <w:r>
+        <w:rPr>
+          <w:rFonts w:ascii="Arial" w:cs="Arial" w:eastAsia="Arial" w:hAnsi="Arial"/>
+          <w:sz w:val="22"/>
+          <w:szCs w:val="22"/>
+        </w:rPr>
+        <w:t xml:space="preserve">El resultado es un criterio único para cualquier persona que deba producir una pieza de INVENTRA: la marca se reconoce por lo que dice y por cómo se ve, y las dos cosas se mantienen estables aunque cambie quien las ejecute. Junto con el documento técnico de diseño, que desarrolla la interfaz del producto, este manual completa la definición visual del proyecto.</w:t>
+      </w:r>
+    </w:p>
+    <w:p>
+      <w:pPr>
+        <w:pStyle w:val="Heading1"/>
+        <w:pageBreakBefore/>
+        <w:spacing w:after="110" w:before="220"/>
+      </w:pPr>
+      <w:bookmarkStart w:name="bm41" w:id="41"/>
+      <w:r>
+        <w:rPr>
+          <w:rFonts w:ascii="Arial" w:cs="Arial" w:eastAsia="Arial" w:hAnsi="Arial"/>
+          <w:b/>
+          <w:bCs/>
+          <w:color w:val="1F3864"/>
+          <w:sz w:val="27"/>
+          <w:szCs w:val="27"/>
+        </w:rPr>
+        <w:t xml:space="preserve">14. Referencias</w:t>
+      </w:r>
+      <w:bookmarkEnd w:id="41"/>
+    </w:p>
+    <w:p>
+      <w:pPr>
+        <w:spacing w:after="110" w:line="262"/>
+        <w:jc w:val="both"/>
+      </w:pPr>
+      <w:r>
+        <w:rPr>
+          <w:rFonts w:ascii="Arial" w:cs="Arial" w:eastAsia="Arial" w:hAnsi="Arial"/>
+          <w:sz w:val="22"/>
+          <w:szCs w:val="22"/>
+        </w:rPr>
+        <w:t xml:space="preserve">Documentos del proyecto:</w:t>
+      </w:r>
+    </w:p>
+    <w:p>
+      <w:pPr>
+        <w:pStyle w:val="ListParagraph"/>
+        <w:numPr>
+          <w:ilvl w:val="0"/>
+          <w:numId w:val="1"/>
+        </w:numPr>
+        <w:spacing w:after="60" w:line="258"/>
+      </w:pPr>
+      <w:r>
+        <w:rPr>
+          <w:rFonts w:ascii="Arial" w:cs="Arial" w:eastAsia="Arial" w:hAnsi="Arial"/>
+          <w:sz w:val="22"/>
+          <w:szCs w:val="22"/>
+        </w:rPr>
+        <w:t xml:space="preserve">Modelo de negocio INVENTRA, formato CREAR del Fondo Emprender.</w:t>
+      </w:r>
+    </w:p>
+    <w:p>
+      <w:pPr>
+        <w:pStyle w:val="ListParagraph"/>
+        <w:numPr>
+          <w:ilvl w:val="0"/>
+          <w:numId w:val="1"/>
+        </w:numPr>
+        <w:spacing w:after="60" w:line="258"/>
+      </w:pPr>
+      <w:r>
+        <w:rPr>
+          <w:rFonts w:ascii="Arial" w:cs="Arial" w:eastAsia="Arial" w:hAnsi="Arial"/>
+          <w:sz w:val="22"/>
+          <w:szCs w:val="22"/>
+        </w:rPr>
+        <w:t xml:space="preserve">Mapa de empatía y Lean Canvas de INVENTRA, revisión 1.</w:t>
+      </w:r>
+    </w:p>
+    <w:p>
+      <w:pPr>
+        <w:pStyle w:val="ListParagraph"/>
+        <w:numPr>
+          <w:ilvl w:val="0"/>
+          <w:numId w:val="1"/>
+        </w:numPr>
+        <w:spacing w:after="60" w:line="258"/>
+      </w:pPr>
+      <w:r>
+        <w:rPr>
+          <w:rFonts w:ascii="Arial" w:cs="Arial" w:eastAsia="Arial" w:hAnsi="Arial"/>
+          <w:sz w:val="22"/>
+          <w:szCs w:val="22"/>
+        </w:rPr>
+        <w:t xml:space="preserve">Especificación de requisitos de software INVENTRA (IEEE 830), revisión 1.</w:t>
+      </w:r>
+    </w:p>
+    <w:p>
+      <w:pPr>
+        <w:pStyle w:val="ListParagraph"/>
+        <w:numPr>
+          <w:ilvl w:val="0"/>
+          <w:numId w:val="1"/>
+        </w:numPr>
+        <w:spacing w:after="60" w:line="258"/>
+      </w:pPr>
+      <w:r>
+        <w:rPr>
+          <w:rFonts w:ascii="Arial" w:cs="Arial" w:eastAsia="Arial" w:hAnsi="Arial"/>
+          <w:sz w:val="22"/>
+          <w:szCs w:val="22"/>
+        </w:rPr>
+        <w:t xml:space="preserve">Documento técnico de diseño de INVENTRA, revisión 1.</w:t>
+      </w:r>
+    </w:p>
+    <w:p>
+      <w:pPr>
+        <w:pStyle w:val="ListParagraph"/>
+        <w:numPr>
+          <w:ilvl w:val="0"/>
+          <w:numId w:val="1"/>
+        </w:numPr>
+        <w:spacing w:after="60" w:line="258"/>
+      </w:pPr>
+      <w:r>
+        <w:rPr>
+          <w:rFonts w:ascii="Arial" w:cs="Arial" w:eastAsia="Arial" w:hAnsi="Arial"/>
+          <w:sz w:val="22"/>
+          <w:szCs w:val="22"/>
+        </w:rPr>
+        <w:t xml:space="preserve">Prototipo de interfaz de INVENTRA (web y móvil, modo claro y modo oscuro).</w:t>
+      </w:r>
+    </w:p>
+    <w:p>
+      <w:pPr>
+        <w:spacing w:after="110" w:line="262"/>
+        <w:jc w:val="both"/>
+      </w:pPr>
+      <w:r>
+        <w:rPr>
+          <w:rFonts w:ascii="Arial" w:cs="Arial" w:eastAsia="Arial" w:hAnsi="Arial"/>
+          <w:sz w:val="22"/>
+          <w:szCs w:val="22"/>
+        </w:rPr>
+        <w:t xml:space="preserve">Fuentes externas:</w:t>
+      </w:r>
+    </w:p>
+    <w:p>
+      <w:pPr>
+        <w:pStyle w:val="ListParagraph"/>
+        <w:numPr>
+          <w:ilvl w:val="0"/>
+          <w:numId w:val="1"/>
+        </w:numPr>
+        <w:spacing w:after="60" w:line="258"/>
+      </w:pPr>
+      <w:r>
+        <w:rPr>
+          <w:rFonts w:ascii="Arial" w:cs="Arial" w:eastAsia="Arial" w:hAnsi="Arial"/>
+          <w:sz w:val="22"/>
+          <w:szCs w:val="22"/>
+        </w:rPr>
+        <w:t xml:space="preserve">World Wide Web Consortium. Web Content Accessibility Guidelines (WCAG) 2.1. W3C, 2018.</w:t>
+      </w:r>
+    </w:p>
+    <w:p>
+      <w:pPr>
+        <w:pStyle w:val="ListParagraph"/>
+        <w:numPr>
+          <w:ilvl w:val="0"/>
+          <w:numId w:val="1"/>
+        </w:numPr>
+        <w:spacing w:after="60" w:line="258"/>
+      </w:pPr>
+      <w:r>
+        <w:rPr>
+          <w:rFonts w:ascii="Arial" w:cs="Arial" w:eastAsia="Arial" w:hAnsi="Arial"/>
+          <w:sz w:val="22"/>
+          <w:szCs w:val="22"/>
+        </w:rPr>
+        <w:t xml:space="preserve">Andersson, R. Inter: familia tipográfica para interfaces. Licencia SIL Open Font License 1.1.</w:t>
+      </w:r>
+    </w:p>
+    <w:p>
+      <w:pPr>
+        <w:pStyle w:val="ListParagraph"/>
+        <w:numPr>
+          <w:ilvl w:val="0"/>
+          <w:numId w:val="1"/>
+        </w:numPr>
+        <w:spacing w:after="60" w:line="258"/>
+      </w:pPr>
+      <w:r>
+        <w:rPr>
+          <w:rFonts w:ascii="Arial" w:cs="Arial" w:eastAsia="Arial" w:hAnsi="Arial"/>
+          <w:sz w:val="22"/>
+          <w:szCs w:val="22"/>
+        </w:rPr>
+        <w:t xml:space="preserve">Wheeler, A. Designing Brand Identity. 5.ª edición. Wiley, 2017.</w:t>
+      </w:r>
+    </w:p>
+    <w:p>
+      <w:pPr>
+        <w:pStyle w:val="ListParagraph"/>
+        <w:numPr>
+          <w:ilvl w:val="0"/>
+          <w:numId w:val="1"/>
+        </w:numPr>
+        <w:spacing w:after="60" w:line="258"/>
+      </w:pPr>
+      <w:r>
+        <w:rPr>
+          <w:rFonts w:ascii="Arial" w:cs="Arial" w:eastAsia="Arial" w:hAnsi="Arial"/>
+          <w:sz w:val="22"/>
+          <w:szCs w:val="22"/>
+        </w:rPr>
+        <w:t xml:space="preserve">Airey, D. Logo Design Love: una guía para crear identidades de marca. 2.ª edición. Anaya Multimedia, 2015.</w:t>
       </w:r>
     </w:p>
     <w:sectPr>

</xml_diff>